<commit_message>
refactor(apps/kolohelios-portfolio): about page from profile.json
about.html now renders its summary, skills, and education from
data/profile.json — generated from tools/resume/profile.cue by `shaka
profile generate` — instead of hand-maintained markup, so the about page
and the résumé can't drift. The hand-authored Specialties list (no résumé
equivalent) stays in the template.

Closes #785.
</commit_message>
<xml_diff>
--- a/apps/kolohelios-portfolio/dist/resume.docx
+++ b/apps/kolohelios-portfolio/dist/resume.docx
@@ -25,10 +25,14 @@
     </w:p>
     <w:p>
       <w:pPr>
-        <w:pStyle w:val="BodyText"/>
-      </w:pPr>
-      <w:r>
-        <w:t xml:space="preserve">(360) 509-8185 • jkedwards@me.com • US Person • Bainbridge Island, WA •</w:t>
+        <w:pStyle w:val="Compact"/>
+        <w:numPr>
+          <w:ilvl w:val="0"/>
+          <w:numId w:val="1001"/>
+        </w:numPr>
+      </w:pPr>
+      <w:r>
+        <w:t xml:space="preserve">509-8185 • jkedwards@me.com • US Person • Bainbridge Island, WA •</w:t>
       </w:r>
       <w:r>
         <w:t xml:space="preserve"> </w:t>
@@ -73,7 +77,7 @@
         <w:pStyle w:val="FirstParagraph"/>
       </w:pPr>
       <w:r>
-        <w:t xml:space="preserve">Business-minded software-engineering leader practicing end-to-end product engineering on streaming data platforms over datasets in the hundreds of millions of records and modernizing developer platforms with Nix and monorepo tooling. In the past year, shipped a Flow-Based Programming data graph (~2.5M events/day and growing), a Property and People data delivery platform that unlocked $1M in net new revenue and, and Scala load shedding for a high-traffic search layer. 11+ years bridging deep IC and engineering leadership; has managed teams of up to 12 ICs.</w:t>
+        <w:t xml:space="preserve">Business-minded software-engineering leader practicing end-to-end product engineering on streaming data platforms over datasets in the hundreds of millions of records and modernizing developer platforms with Nix and monorepo tooling. In the past year, shipped a Flow-Based Programming data graph (~2.5M events/day and growing), a Property and People data delivery platform that unlocked $1M in net new revenue, and Scala load shedding for a high-traffic search layer. 11+ years bridging deep IC and engineering leadership; has managed teams of up to 12 ICs.</w:t>
       </w:r>
     </w:p>
     <w:bookmarkEnd w:id="11"/>
@@ -91,7 +95,7 @@
         <w:pStyle w:val="Compact"/>
         <w:numPr>
           <w:ilvl w:val="0"/>
-          <w:numId w:val="1001"/>
+          <w:numId w:val="1002"/>
         </w:numPr>
       </w:pPr>
       <w:r>
@@ -113,7 +117,7 @@
         <w:pStyle w:val="Compact"/>
         <w:numPr>
           <w:ilvl w:val="0"/>
-          <w:numId w:val="1001"/>
+          <w:numId w:val="1002"/>
         </w:numPr>
       </w:pPr>
       <w:r>
@@ -135,7 +139,7 @@
         <w:pStyle w:val="Compact"/>
         <w:numPr>
           <w:ilvl w:val="0"/>
-          <w:numId w:val="1001"/>
+          <w:numId w:val="1002"/>
         </w:numPr>
       </w:pPr>
       <w:r>
@@ -157,7 +161,7 @@
         <w:pStyle w:val="Compact"/>
         <w:numPr>
           <w:ilvl w:val="0"/>
-          <w:numId w:val="1001"/>
+          <w:numId w:val="1002"/>
         </w:numPr>
       </w:pPr>
       <w:r>
@@ -179,7 +183,7 @@
         <w:pStyle w:val="Compact"/>
         <w:numPr>
           <w:ilvl w:val="0"/>
-          <w:numId w:val="1001"/>
+          <w:numId w:val="1002"/>
         </w:numPr>
       </w:pPr>
       <w:r>
@@ -201,7 +205,7 @@
         <w:pStyle w:val="Compact"/>
         <w:numPr>
           <w:ilvl w:val="0"/>
-          <w:numId w:val="1001"/>
+          <w:numId w:val="1002"/>
         </w:numPr>
       </w:pPr>
       <w:r>
@@ -223,7 +227,7 @@
         <w:pStyle w:val="Compact"/>
         <w:numPr>
           <w:ilvl w:val="0"/>
-          <w:numId w:val="1001"/>
+          <w:numId w:val="1002"/>
         </w:numPr>
       </w:pPr>
       <w:r>
@@ -282,7 +286,7 @@
         <w:pStyle w:val="Compact"/>
         <w:numPr>
           <w:ilvl w:val="0"/>
-          <w:numId w:val="1002"/>
+          <w:numId w:val="1003"/>
         </w:numPr>
       </w:pPr>
       <w:r>
@@ -294,7 +298,7 @@
         <w:pStyle w:val="Compact"/>
         <w:numPr>
           <w:ilvl w:val="0"/>
-          <w:numId w:val="1002"/>
+          <w:numId w:val="1003"/>
         </w:numPr>
       </w:pPr>
       <w:r>
@@ -306,7 +310,7 @@
         <w:pStyle w:val="Compact"/>
         <w:numPr>
           <w:ilvl w:val="0"/>
-          <w:numId w:val="1002"/>
+          <w:numId w:val="1003"/>
         </w:numPr>
       </w:pPr>
       <w:r>
@@ -318,7 +322,7 @@
         <w:pStyle w:val="Compact"/>
         <w:numPr>
           <w:ilvl w:val="0"/>
-          <w:numId w:val="1002"/>
+          <w:numId w:val="1003"/>
         </w:numPr>
       </w:pPr>
       <w:r>
@@ -330,7 +334,7 @@
         <w:pStyle w:val="Compact"/>
         <w:numPr>
           <w:ilvl w:val="0"/>
-          <w:numId w:val="1002"/>
+          <w:numId w:val="1003"/>
         </w:numPr>
       </w:pPr>
       <w:r>
@@ -342,7 +346,7 @@
         <w:pStyle w:val="Compact"/>
         <w:numPr>
           <w:ilvl w:val="0"/>
-          <w:numId w:val="1002"/>
+          <w:numId w:val="1003"/>
         </w:numPr>
       </w:pPr>
       <w:r>
@@ -354,7 +358,7 @@
         <w:pStyle w:val="Compact"/>
         <w:numPr>
           <w:ilvl w:val="0"/>
-          <w:numId w:val="1002"/>
+          <w:numId w:val="1003"/>
         </w:numPr>
       </w:pPr>
       <w:r>
@@ -384,7 +388,7 @@
         <w:pStyle w:val="Compact"/>
         <w:numPr>
           <w:ilvl w:val="0"/>
-          <w:numId w:val="1003"/>
+          <w:numId w:val="1004"/>
         </w:numPr>
       </w:pPr>
       <w:r>
@@ -396,7 +400,7 @@
         <w:pStyle w:val="Compact"/>
         <w:numPr>
           <w:ilvl w:val="0"/>
-          <w:numId w:val="1003"/>
+          <w:numId w:val="1004"/>
         </w:numPr>
       </w:pPr>
       <w:r>
@@ -408,7 +412,7 @@
         <w:pStyle w:val="Compact"/>
         <w:numPr>
           <w:ilvl w:val="0"/>
-          <w:numId w:val="1003"/>
+          <w:numId w:val="1004"/>
         </w:numPr>
       </w:pPr>
       <w:r>
@@ -420,7 +424,7 @@
         <w:pStyle w:val="Compact"/>
         <w:numPr>
           <w:ilvl w:val="0"/>
-          <w:numId w:val="1003"/>
+          <w:numId w:val="1004"/>
         </w:numPr>
       </w:pPr>
       <w:r>
@@ -432,7 +436,7 @@
         <w:pStyle w:val="Compact"/>
         <w:numPr>
           <w:ilvl w:val="0"/>
-          <w:numId w:val="1003"/>
+          <w:numId w:val="1004"/>
         </w:numPr>
       </w:pPr>
       <w:r>
@@ -472,7 +476,7 @@
         <w:pStyle w:val="Compact"/>
         <w:numPr>
           <w:ilvl w:val="0"/>
-          <w:numId w:val="1004"/>
+          <w:numId w:val="1005"/>
         </w:numPr>
       </w:pPr>
       <w:r>
@@ -484,7 +488,7 @@
         <w:pStyle w:val="Compact"/>
         <w:numPr>
           <w:ilvl w:val="0"/>
-          <w:numId w:val="1004"/>
+          <w:numId w:val="1005"/>
         </w:numPr>
       </w:pPr>
       <w:r>
@@ -496,7 +500,7 @@
         <w:pStyle w:val="Compact"/>
         <w:numPr>
           <w:ilvl w:val="0"/>
-          <w:numId w:val="1004"/>
+          <w:numId w:val="1005"/>
         </w:numPr>
       </w:pPr>
       <w:r>
@@ -508,7 +512,7 @@
         <w:pStyle w:val="Compact"/>
         <w:numPr>
           <w:ilvl w:val="0"/>
-          <w:numId w:val="1004"/>
+          <w:numId w:val="1005"/>
         </w:numPr>
       </w:pPr>
       <w:r>
@@ -548,7 +552,7 @@
         <w:pStyle w:val="Compact"/>
         <w:numPr>
           <w:ilvl w:val="0"/>
-          <w:numId w:val="1005"/>
+          <w:numId w:val="1006"/>
         </w:numPr>
       </w:pPr>
       <w:r>
@@ -588,7 +592,7 @@
         <w:pStyle w:val="Compact"/>
         <w:numPr>
           <w:ilvl w:val="0"/>
-          <w:numId w:val="1006"/>
+          <w:numId w:val="1007"/>
         </w:numPr>
       </w:pPr>
       <w:r>
@@ -600,7 +604,7 @@
         <w:pStyle w:val="Compact"/>
         <w:numPr>
           <w:ilvl w:val="0"/>
-          <w:numId w:val="1006"/>
+          <w:numId w:val="1007"/>
         </w:numPr>
       </w:pPr>
       <w:r>
@@ -612,7 +616,7 @@
         <w:pStyle w:val="Compact"/>
         <w:numPr>
           <w:ilvl w:val="0"/>
-          <w:numId w:val="1006"/>
+          <w:numId w:val="1007"/>
         </w:numPr>
       </w:pPr>
       <w:r>
@@ -624,7 +628,7 @@
         <w:pStyle w:val="Compact"/>
         <w:numPr>
           <w:ilvl w:val="0"/>
-          <w:numId w:val="1006"/>
+          <w:numId w:val="1007"/>
         </w:numPr>
       </w:pPr>
       <w:r>
@@ -636,7 +640,7 @@
         <w:pStyle w:val="Compact"/>
         <w:numPr>
           <w:ilvl w:val="0"/>
-          <w:numId w:val="1006"/>
+          <w:numId w:val="1007"/>
         </w:numPr>
       </w:pPr>
       <w:r>
@@ -821,6 +825,91 @@
       </w:pPr>
     </w:lvl>
   </w:abstractNum>
+  <w:abstractNum w:abstractNumId="9943360">
+    <w:nsid w:val="A9943360"/>
+    <w:multiLevelType w:val="multilevel"/>
+    <w:lvl w:ilvl="0">
+      <w:start w:val="360"/>
+      <w:numFmt w:val="decimal"/>
+      <w:lvlText w:val="(%1)"/>
+      <w:lvlJc w:val="left"/>
+      <w:pPr>
+        <w:ind w:left="720" w:hanging="360"/>
+      </w:pPr>
+    </w:lvl>
+    <w:lvl w:ilvl="1">
+      <w:start w:val="360"/>
+      <w:numFmt w:val="decimal"/>
+      <w:lvlText w:val="(%2)"/>
+      <w:lvlJc w:val="left"/>
+      <w:pPr>
+        <w:ind w:left="1440" w:hanging="360"/>
+      </w:pPr>
+    </w:lvl>
+    <w:lvl w:ilvl="2">
+      <w:start w:val="360"/>
+      <w:numFmt w:val="decimal"/>
+      <w:lvlText w:val="(%3)"/>
+      <w:lvlJc w:val="left"/>
+      <w:pPr>
+        <w:ind w:left="2160" w:hanging="360"/>
+      </w:pPr>
+    </w:lvl>
+    <w:lvl w:ilvl="3">
+      <w:start w:val="360"/>
+      <w:numFmt w:val="decimal"/>
+      <w:lvlText w:val="(%4)"/>
+      <w:lvlJc w:val="left"/>
+      <w:pPr>
+        <w:ind w:left="2880" w:hanging="360"/>
+      </w:pPr>
+    </w:lvl>
+    <w:lvl w:ilvl="4">
+      <w:start w:val="360"/>
+      <w:numFmt w:val="decimal"/>
+      <w:lvlText w:val="(%5)"/>
+      <w:lvlJc w:val="left"/>
+      <w:pPr>
+        <w:ind w:left="3600" w:hanging="360"/>
+      </w:pPr>
+    </w:lvl>
+    <w:lvl w:ilvl="5">
+      <w:start w:val="360"/>
+      <w:numFmt w:val="decimal"/>
+      <w:lvlText w:val="(%6)"/>
+      <w:lvlJc w:val="left"/>
+      <w:pPr>
+        <w:ind w:left="4320" w:hanging="360"/>
+      </w:pPr>
+    </w:lvl>
+    <w:lvl w:ilvl="6">
+      <w:start w:val="360"/>
+      <w:numFmt w:val="decimal"/>
+      <w:lvlText w:val="(%7)"/>
+      <w:lvlJc w:val="left"/>
+      <w:pPr>
+        <w:ind w:left="5040" w:hanging="360"/>
+      </w:pPr>
+    </w:lvl>
+    <w:lvl w:ilvl="7">
+      <w:start w:val="360"/>
+      <w:numFmt w:val="decimal"/>
+      <w:lvlText w:val="(%8)"/>
+      <w:lvlJc w:val="left"/>
+      <w:pPr>
+        <w:ind w:left="5760" w:hanging="360"/>
+      </w:pPr>
+    </w:lvl>
+    <w:lvl w:ilvl="8">
+      <w:start w:val="360"/>
+      <w:numFmt w:val="decimal"/>
+      <w:lvlText w:val="(%9)"/>
+      <w:lvlJc w:val="left"/>
+      <w:pPr>
+        <w:ind w:left="6480" w:hanging="360"/>
+      </w:pPr>
+    </w:lvl>
+  </w:abstractNum>
   <w:abstractNum w:abstractNumId="991">
     <w:nsid w:val="0000A991"/>
     <w:multiLevelType w:val="multilevel"/>
@@ -928,7 +1017,34 @@
     <w:abstractNumId w:val="990"/>
   </w:num>
   <w:num w:numId="1001">
-    <w:abstractNumId w:val="991"/>
+    <w:abstractNumId w:val="9943360"/>
+    <w:lvlOverride w:ilvl="0">
+      <w:startOverride w:val="360"/>
+    </w:lvlOverride>
+    <w:lvlOverride w:ilvl="1">
+      <w:startOverride w:val="360"/>
+    </w:lvlOverride>
+    <w:lvlOverride w:ilvl="2">
+      <w:startOverride w:val="360"/>
+    </w:lvlOverride>
+    <w:lvlOverride w:ilvl="3">
+      <w:startOverride w:val="360"/>
+    </w:lvlOverride>
+    <w:lvlOverride w:ilvl="4">
+      <w:startOverride w:val="360"/>
+    </w:lvlOverride>
+    <w:lvlOverride w:ilvl="5">
+      <w:startOverride w:val="360"/>
+    </w:lvlOverride>
+    <w:lvlOverride w:ilvl="6">
+      <w:startOverride w:val="360"/>
+    </w:lvlOverride>
+    <w:lvlOverride w:ilvl="7">
+      <w:startOverride w:val="360"/>
+    </w:lvlOverride>
+    <w:lvlOverride w:ilvl="8">
+      <w:startOverride w:val="360"/>
+    </w:lvlOverride>
   </w:num>
   <w:num w:numId="1002">
     <w:abstractNumId w:val="991"/>
@@ -943,6 +1059,9 @@
     <w:abstractNumId w:val="991"/>
   </w:num>
   <w:num w:numId="1006">
+    <w:abstractNumId w:val="991"/>
+  </w:num>
+  <w:num w:numId="1007">
     <w:abstractNumId w:val="991"/>
   </w:num>
 </w:numbering>

</xml_diff>